<commit_message>
Proyecto Integrador: uno de los integrantes sube la entrega del equipo y queda para todos, y sin enlace aparte en los cinco cursos
Co-Authored-By: Claude Opus 5.5 <noreply@anthropic.com>
</commit_message>
<xml_diff>
--- a/Arquitectura de Sistemas Computacionales/Clases/Proyecto Integrador/Enunciado Proyecto Integrador - Arquitectura de Sistemas Computacionales.docx
+++ b/Arquitectura de Sistemas Computacionales/Clases/Proyecto Integrador/Enunciado Proyecto Integrador - Arquitectura de Sistemas Computacionales.docx
@@ -1171,7 +1171,7 @@
           <w:color w:val="2B2B2B"/>
           <w:sz w:val="22"/>
         </w:rPr>
-        <w:t xml:space="preserve"> el .zip (máximo 50 MB) y, junto a él, el repositorio de GitHub donde está el workflow, o la carpeta de Drive del equipo si el workflow se entrega solo como archivo.</w:t>
+        <w:t xml:space="preserve"> solo el .zip, de máximo 50 MB. No se sube ningún enlace aparte: todo va dentro del .zip.</w:t>
       </w:r>
     </w:p>
     <w:p>
@@ -1186,7 +1186,7 @@
           <w:color w:val="2B2B2B"/>
           <w:sz w:val="22"/>
         </w:rPr>
-        <w:t>Cada integrante sube la entrega del equipo</w:t>
+        <w:t>Uno de los integrantes sube la entrega del equipo</w:t>
       </w:r>
       <w:r>
         <w:rPr>
@@ -1195,7 +1195,7 @@
           <w:color w:val="2B2B2B"/>
           <w:sz w:val="22"/>
         </w:rPr>
-        <w:t xml:space="preserve"> desde su propia cuenta: el mismo .zip y el mismo enlace; una sola entrega por estudiante.</w:t>
+        <w:t xml:space="preserve"> en la plataforma del curso y queda para todos.</w:t>
       </w:r>
     </w:p>
     <w:p>

</xml_diff>